<commit_message>
Add STM32 AE firmware (compiles, maths verified vs Python reference); ESP32 compile-checked; docs and report updated
</commit_message>
<xml_diff>
--- a/docs/Project_Report.docx
+++ b/docs/Project_Report.docx
@@ -4168,7 +4168,7 @@
                 <w:sz w:val="19"/>
                 <w:szCs w:val="19"/>
               </w:rPr>
-              <w:t xml:space="preserve">STM32 firmware (CubeIDE + CMSIS-DSP)</w:t>
+              <w:t xml:space="preserve">STM32 firmware (Arduino + STM32duino)</w:t>
             </w:r>
           </w:p>
         </w:tc>
@@ -4197,7 +4197,7 @@
                 <w:sz w:val="19"/>
                 <w:szCs w:val="19"/>
               </w:rPr>
-              <w:t xml:space="preserve">200 kHz/channel ADC + DMA, 9 features per channel per 100 ms, UART at 230400 baud (specified)</w:t>
+              <w:t xml:space="preserve">200 kHz/channel ADC + DMA, 9 features per channel per 100 ms, UART at 230400 baud; feature maths verified against the Python reference</w:t>
             </w:r>
           </w:p>
         </w:tc>
@@ -7511,7 +7511,7 @@
                 <w:sz w:val="19"/>
                 <w:szCs w:val="19"/>
               </w:rPr>
-              <w:t xml:space="preserve">Written; hardware testing pending</w:t>
+              <w:t xml:space="preserve">Written, compiles; hardware testing pending</w:t>
             </w:r>
           </w:p>
         </w:tc>
@@ -7574,7 +7574,7 @@
                 <w:sz w:val="19"/>
                 <w:szCs w:val="19"/>
               </w:rPr>
-              <w:t xml:space="preserve">Specified; to be implemented</w:t>
+              <w:t xml:space="preserve">Written, compiles, maths verified; hardware testing pending</w:t>
             </w:r>
           </w:p>
         </w:tc>

</xml_diff>